<commit_message>
style(relazione): recepisce la formattazione rivista in Word
Quattro modifiche fatte da FB sul documento di esempio e riportate nel template:
colonne Gruppo/Qualita' (§3), PS recipiente e pressione di taratura (§6.2) e le due
colonne di verifica (§7) centrate; interruzione di pagina prima di §2.2 e di §4;
margine del pie' di pagina della seconda sezione da 708 a 428 twip.

Il conteggio pagine passa da NUMPAGES a SECTIONPAGES: contava anche la copertina,
per cui il totale risultava di uno superiore a quello del corpo.

Le interruzioni usano pageBreakBefore sul titolo invece di un <w:br> nel paragrafo
precedente: prima di §4 quel paragrafo e' il tag di chiusura di un condizionale, che
docxtemplater rimuove portandosi via il salto.

Co-Authored-By: Claude Opus 5 <noreply@anthropic.com>
</commit_message>
<xml_diff>
--- a/public/templates/relazione-dm329.docx
+++ b/public/templates/relazione-dm329.docx
@@ -1156,6 +1156,7 @@
     </w:p>
     <w:p>
       <w:pPr>
+        <w:pageBreakBefore/>
         <w:pStyle w:val="Titolo2"/>
         <w:keepNext/>
         <w:spacing w:after="160"/>
@@ -1524,6 +1525,7 @@
           <w:p>
             <w:pPr>
               <w:spacing w:after="0"/>
+              <w:jc w:val="center"/>
               <w:rPr>
                 <w:rFonts w:ascii="Segoe UI" w:hAnsi="Segoe UI" w:cs="Segoe UI"/>
                 <w:sz w:val="22"/>
@@ -1576,6 +1578,7 @@
           <w:p>
             <w:pPr>
               <w:spacing w:after="0"/>
+              <w:jc w:val="center"/>
               <w:rPr>
                 <w:rFonts w:ascii="Segoe UI" w:hAnsi="Segoe UI" w:cs="Segoe UI"/>
                 <w:sz w:val="22"/>
@@ -1654,6 +1657,7 @@
           <w:p>
             <w:pPr>
               <w:spacing w:after="0"/>
+              <w:jc w:val="center"/>
               <w:rPr>
                 <w:rFonts w:ascii="Segoe UI" w:hAnsi="Segoe UI" w:cs="Segoe UI"/>
                 <w:sz w:val="22"/>
@@ -1702,6 +1706,7 @@
           <w:p>
             <w:pPr>
               <w:spacing w:after="0"/>
+              <w:jc w:val="center"/>
               <w:rPr>
                 <w:rFonts w:ascii="Segoe UI" w:hAnsi="Segoe UI" w:cs="Segoe UI"/>
                 <w:sz w:val="22"/>
@@ -1855,6 +1860,7 @@
     </w:p>
     <w:p>
       <w:pPr>
+        <w:pageBreakBefore/>
         <w:pStyle w:val="Titolo1"/>
       </w:pPr>
       <w:r>
@@ -5388,6 +5394,7 @@
           <w:p>
             <w:pPr>
               <w:spacing w:after="0"/>
+              <w:jc w:val="center"/>
               <w:rPr>
                 <w:rFonts w:ascii="Segoe UI" w:hAnsi="Segoe UI" w:cs="Segoe UI"/>
                 <w:sz w:val="22"/>
@@ -5414,6 +5421,7 @@
           <w:p>
             <w:pPr>
               <w:spacing w:after="0"/>
+              <w:jc w:val="center"/>
               <w:rPr>
                 <w:rFonts w:ascii="Segoe UI" w:hAnsi="Segoe UI" w:cs="Segoe UI"/>
                 <w:sz w:val="22"/>
@@ -5562,6 +5570,7 @@
           <w:p>
             <w:pPr>
               <w:spacing w:after="0"/>
+              <w:jc w:val="center"/>
               <w:rPr>
                 <w:rFonts w:ascii="Segoe UI" w:hAnsi="Segoe UI" w:cs="Segoe UI"/>
                 <w:sz w:val="22"/>
@@ -5586,6 +5595,7 @@
           <w:p>
             <w:pPr>
               <w:spacing w:after="0"/>
+              <w:jc w:val="center"/>
               <w:rPr>
                 <w:rFonts w:ascii="Segoe UI" w:hAnsi="Segoe UI" w:cs="Segoe UI"/>
                 <w:sz w:val="22"/>
@@ -5736,7 +5746,7 @@
           <w:p>
             <w:pPr>
               <w:spacing w:after="0"/>
-              <w:jc w:val="left"/>
+              <w:jc w:val="center"/>
               <w:rPr>
                 <w:rFonts w:ascii="Segoe UI" w:hAnsi="Segoe UI" w:cs="Segoe UI"/>
                 <w:sz w:val="22"/>
@@ -5763,7 +5773,7 @@
           <w:p>
             <w:pPr>
               <w:spacing w:after="0"/>
-              <w:jc w:val="left"/>
+              <w:jc w:val="center"/>
               <w:rPr>
                 <w:rFonts w:ascii="Segoe UI" w:hAnsi="Segoe UI" w:cs="Segoe UI"/>
                 <w:sz w:val="22"/>
@@ -5819,7 +5829,7 @@
           <w:p>
             <w:pPr>
               <w:spacing w:after="0"/>
-              <w:jc w:val="left"/>
+              <w:jc w:val="center"/>
               <w:rPr>
                 <w:rFonts w:ascii="Segoe UI" w:hAnsi="Segoe UI" w:cs="Segoe UI"/>
                 <w:sz w:val="22"/>
@@ -5862,7 +5872,7 @@
           <w:p>
             <w:pPr>
               <w:spacing w:after="0"/>
-              <w:jc w:val="left"/>
+              <w:jc w:val="center"/>
               <w:rPr>
                 <w:rFonts w:ascii="Segoe UI" w:hAnsi="Segoe UI" w:cs="Segoe UI"/>
                 <w:sz w:val="22"/>
@@ -5935,7 +5945,7 @@
           <w:p>
             <w:pPr>
               <w:spacing w:after="0"/>
-              <w:jc w:val="left"/>
+              <w:jc w:val="center"/>
               <w:rPr>
                 <w:rFonts w:ascii="Segoe UI" w:hAnsi="Segoe UI" w:cs="Segoe UI"/>
                 <w:sz w:val="22"/>
@@ -5978,7 +5988,7 @@
           <w:p>
             <w:pPr>
               <w:spacing w:after="0"/>
-              <w:jc w:val="left"/>
+              <w:jc w:val="center"/>
               <w:rPr>
                 <w:rFonts w:ascii="Segoe UI" w:hAnsi="Segoe UI" w:cs="Segoe UI"/>
                 <w:sz w:val="22"/>
@@ -6435,7 +6445,7 @@
       <w:footerReference w:type="first" r:id="rId16"/>
       <w:type w:val="continuous"/>
       <w:pgSz w:w="11906" w:h="16838"/>
-      <w:pgMar w:top="1134" w:right="1134" w:bottom="1134" w:left="1134" w:header="708" w:footer="708" w:gutter="0"/>
+      <w:pgMar w:top="1134" w:right="1134" w:bottom="1134" w:left="1134" w:header="708" w:footer="428" w:gutter="0"/>
       <w:pgNumType w:start="1"/>
       <w:cols w:space="720"/>
       <w:docGrid w:linePitch="272"/>
@@ -6570,12 +6580,12 @@
         <w:r>
           <w:t xml:space="preserve"> di </w:t>
         </w:r>
-        <w:fldSimple w:instr=" NUMPAGES   \* MERGEFORMAT ">
+        <w:fldSimple w:instr=" SECTIONPAGES   \* MERGEFORMAT ">
           <w:r>
             <w:rPr>
               <w:noProof/>
             </w:rPr>
-            <w:t>9</w:t>
+            <w:t>8</w:t>
           </w:r>
         </w:fldSimple>
       </w:sdtContent>

</xml_diff>

<commit_message>
fix(relazione): nasconde il blocco delle altre apparecchiature quando e' vuoto
L'intestazione «Altre apparecchiature soggette al D.M. 329/2004:» e la sua tabella
comparivano sempre, anche su impianti in cui nessuna apparecchiatura oltre ai serbatoi
e' soggetta: restava un titolo con sotto una tabella con la sola riga di intestazione.

Il modello espone `protezioni.haAltre` e il template avvolge titolo e tabella in quel
condizionale. Serve un booleano e non un `{#altre}`, che ripeterebbe il blocco una
volta per riga.

Co-Authored-By: Claude Opus 5 <noreply@anthropic.com>
</commit_message>
<xml_diff>
--- a/public/templates/relazione-dm329.docx
+++ b/public/templates/relazione-dm329.docx
@@ -4379,6 +4379,23 @@
           <w:sz w:val="22"/>
           <w:szCs w:val="22"/>
         </w:rPr>
+        <w:t>{#protezioni.haAltre}</w:t>
+      </w:r>
+    </w:p>
+    <w:p>
+      <w:pPr>
+        <w:rPr>
+          <w:rFonts w:ascii="Segoe UI" w:hAnsi="Segoe UI" w:cs="Segoe UI"/>
+          <w:sz w:val="22"/>
+          <w:szCs w:val="22"/>
+        </w:rPr>
+      </w:pPr>
+      <w:r>
+        <w:rPr>
+          <w:rFonts w:ascii="Segoe UI" w:hAnsi="Segoe UI" w:cs="Segoe UI"/>
+          <w:sz w:val="22"/>
+          <w:szCs w:val="22"/>
+        </w:rPr>
         <w:t>Altre apparecchiature soggette al D.M. 329/2004:</w:t>
       </w:r>
     </w:p>
@@ -4597,6 +4614,23 @@
         </w:tc>
       </w:tr>
     </w:tbl>
+    <w:p>
+      <w:pPr>
+        <w:rPr>
+          <w:rFonts w:ascii="Segoe UI" w:hAnsi="Segoe UI" w:cs="Segoe UI"/>
+          <w:sz w:val="22"/>
+          <w:szCs w:val="22"/>
+        </w:rPr>
+      </w:pPr>
+      <w:r>
+        <w:rPr>
+          <w:rFonts w:ascii="Segoe UI" w:hAnsi="Segoe UI" w:cs="Segoe UI"/>
+          <w:sz w:val="22"/>
+          <w:szCs w:val="22"/>
+        </w:rPr>
+        <w:t>{/protezioni.haAltre}</w:t>
+      </w:r>
+    </w:p>
     <w:p>
       <w:pPr>
         <w:pStyle w:val="Titolo2"/>

</xml_diff>

<commit_message>
fix(dm329): corregge i confini < vs <= nella classificazione recipienti
L'art. 2 comma i del DM 329/2004 esclude i recipienti con V<=25 l, e
con PS<=12 bar fino a V<=50 l (estremi inclusi), mentre il codice
usava < stretto su entrambi: un serbatoio da esattamente 50 l e
PS<=12 bar veniva erroneamente marcato come soggetto a dichiarazione
di messa in servizio invece che escluso.

Corretto anche l'estremo opposto: l'art. 5 comma 1 lettera c esenta
dalla verifica solo per PS*V minore (stretto) di 8000 bar*l, mentre
il codice usava <=, sottostimando l'obbligo esattamente al confine.

Aggiornata anche la tabella statica dei criteri (par. 5.1) nel
template Word, che riportava gli stessi confini sbagliati.
</commit_message>
<xml_diff>
--- a/public/templates/relazione-dm329.docx
+++ b/public/templates/relazione-dm329.docx
@@ -2202,7 +2202,7 @@
                 <w:sz w:val="22"/>
                 <w:szCs w:val="22"/>
               </w:rPr>
-              <w:t>V &lt; 25 l</w:t>
+              <w:t>V ≤ 25 l</w:t>
             </w:r>
           </w:p>
         </w:tc>
@@ -2280,25 +2280,25 @@
                 <w:sz w:val="22"/>
                 <w:szCs w:val="22"/>
               </w:rPr>
-              <w:t>25 ≤ V &lt; 50 l</w:t>
-            </w:r>
-          </w:p>
-          <w:p>
-            <w:pPr>
-              <w:spacing w:after="0"/>
-              <w:rPr>
-                <w:rFonts w:ascii="Segoe UI" w:hAnsi="Segoe UI" w:cs="Segoe UI"/>
-                <w:sz w:val="22"/>
-                <w:szCs w:val="22"/>
-              </w:rPr>
-            </w:pPr>
-            <w:r>
-              <w:rPr>
-                <w:rFonts w:ascii="Segoe UI" w:hAnsi="Segoe UI" w:cs="Segoe UI"/>
-                <w:sz w:val="22"/>
-                <w:szCs w:val="22"/>
-              </w:rPr>
-              <w:t>PS &lt; 12 bar</w:t>
+              <w:t>25 &lt; V ≤ 50 l</w:t>
+            </w:r>
+          </w:p>
+          <w:p>
+            <w:pPr>
+              <w:spacing w:after="0"/>
+              <w:rPr>
+                <w:rFonts w:ascii="Segoe UI" w:hAnsi="Segoe UI" w:cs="Segoe UI"/>
+                <w:sz w:val="22"/>
+                <w:szCs w:val="22"/>
+              </w:rPr>
+            </w:pPr>
+            <w:r>
+              <w:rPr>
+                <w:rFonts w:ascii="Segoe UI" w:hAnsi="Segoe UI" w:cs="Segoe UI"/>
+                <w:sz w:val="22"/>
+                <w:szCs w:val="22"/>
+              </w:rPr>
+              <w:t>PS ≤ 12 bar</w:t>
             </w:r>
           </w:p>
         </w:tc>
@@ -2378,7 +2378,7 @@
                 <w:szCs w:val="22"/>
                 <w:lang w:val="en-GB"/>
               </w:rPr>
-              <w:t>V ≥ 50 l, PS ≤ 12 bar</w:t>
+              <w:t>V &gt; 50 l, PS ≤ 12 bar</w:t>
             </w:r>
           </w:p>
           <w:p>
@@ -2398,7 +2398,7 @@
                 <w:szCs w:val="22"/>
                 <w:lang w:val="en-GB"/>
               </w:rPr>
-              <w:t>PS×V ≤ 8000 bar·l</w:t>
+              <w:t>PS×V &lt; 8000 bar·l</w:t>
             </w:r>
           </w:p>
         </w:tc>
@@ -2476,7 +2476,7 @@
                 <w:sz w:val="22"/>
                 <w:szCs w:val="22"/>
               </w:rPr>
-              <w:t xml:space="preserve">PS×V &gt; 8000 bar·l, oppure </w:t>
+              <w:t xml:space="preserve">PS×V ≥ 8000 bar·l, oppure </w:t>
             </w:r>
           </w:p>
           <w:p>

</xml_diff>